<commit_message>
S6: résultat du test A
Co-Authored-By: Claude Sonnet 5.5 <noreply@anthropic.com>
Claude-Session: https://claude.ai/code/session_011dcQ2XSSUyeAhY7MW4hYg2
</commit_message>
<xml_diff>
--- a/docs/s6/UrbanFlow_template_S6.docx
+++ b/docs/s6/UrbanFlow_template_S6.docx
@@ -862,7 +862,7 @@
     </w:p>
     <w:p>
       <w:r>
-        <w:t>Les réponses ci-dessous sont à copier depuis ton Dify après avoir lancé les deux tests. Elles ne sont pas remplies ici pour ne rien inventer.</w:t>
+        <w:t>Test A : réponse réelle obtenue dans Dify. Test B : réponse à copier depuis Dify, non remplie ici pour ne rien inventer.</w:t>
       </w:r>
     </w:p>
     <w:p>
@@ -922,7 +922,7 @@
           </w:tcPr>
           <w:p>
             <w:r>
-              <w:t>Quel bus prend-on de Ouakam au Plateau ? (ou : ligne 7, quels quartiers ?)</w:t>
+              <w:t>Ligne 7, Ouakam vers Palais 2</w:t>
             </w:r>
           </w:p>
         </w:tc>
@@ -988,7 +988,17 @@
           </w:tcPr>
           <w:p>
             <w:r>
-              <w:t>À COLLER : réponse obtenue dans Dify</w:t>
+              <w:t>FICHE TRAJET : 7, Ouakam &gt; Palais 2, jour et heure non précisés.</w:t>
+              <w:br/>
+              <w:t>TEMPS DE TRAJET : non fourni ici, voir le calcul de trajet de l'application (TomTom).</w:t>
+              <w:br/>
+              <w:t>ANALYSE : non disponible.</w:t>
+              <w:br/>
+              <w:t>ALERTES : pas de relevé terrain en bus, heures de pointe non précisées, heure demandée non fournie.</w:t>
+              <w:br/>
+              <w:t>RECOMMANDATIONS : vérifier le temps de trajet sur l'application TomTom avant de partir.</w:t>
+              <w:br/>
+              <w:t>Source : catalogue DDD.</w:t>
             </w:r>
           </w:p>
         </w:tc>

</xml_diff>

<commit_message>
S6: résultat du test B
Co-Authored-By: Claude Sonnet 5.5 <noreply@anthropic.com>
Claude-Session: https://claude.ai/code/session_011dcQ2XSSUyeAhY7MW4hYg2
</commit_message>
<xml_diff>
--- a/docs/s6/UrbanFlow_template_S6.docx
+++ b/docs/s6/UrbanFlow_template_S6.docx
@@ -862,7 +862,7 @@
     </w:p>
     <w:p>
       <w:r>
-        <w:t>Test A : réponse réelle obtenue dans Dify. Test B : réponse à copier depuis Dify, non remplie ici pour ne rien inventer.</w:t>
+        <w:t>Les réponses des tests A et B sont les réponses réelles obtenues dans Dify.</w:t>
       </w:r>
     </w:p>
     <w:p>
@@ -1172,7 +1172,17 @@
           </w:tcPr>
           <w:p>
             <w:r>
-              <w:t>À COLLER : réponse obtenue dans Dify</w:t>
+              <w:t>FICHE TRAJET : ligne 7, Ouakam &gt; Palais 2, jour et heure non précisés.</w:t>
+              <w:br/>
+              <w:t>TEMPS DE TRAJET : 25 min de trajet, attente 12 min, relevé terrain en bus.</w:t>
+              <w:br/>
+              <w:t>ANALYSE : non disponible.</w:t>
+              <w:br/>
+              <w:t>ALERTES : pas de précision d'heure de relevé, données limitées à un seul relevé terrain.</w:t>
+              <w:br/>
+              <w:t>RECOMMANDATIONS : prévoyez 25 min de trajet + 12 min d'attente.</w:t>
+              <w:br/>
+              <w:t>Source : TERRAIN, relevé usager.</w:t>
             </w:r>
           </w:p>
         </w:tc>
@@ -1203,7 +1213,7 @@
     <w:p/>
     <w:p>
       <w:r>
-        <w:t>Remarque : ce relevé de test est un exemple de format pour la démo, pas une mesure réelle. Remplace-le par un vrai chronométrage si tu en as un (256 caractères maximum).</w:t>
+        <w:t>Remarque : le relevé du Test B est un exemple de test, pas une mesure réelle. Limite observée : la réponse indique que l'heure du relevé n'est pas précisée, alors que le relevé contenait une date et une heure. À corriger dans le prompt si besoin (recopier l'horodatage fourni).</w:t>
       </w:r>
     </w:p>
     <w:p>

</xml_diff>

<commit_message>
S6: captures des tests A et B
Co-Authored-By: Claude Sonnet 5.5 <noreply@anthropic.com>
Claude-Session: https://claude.ai/code/session_011dcQ2XSSUyeAhY7MW4hYg2
</commit_message>
<xml_diff>
--- a/docs/s6/UrbanFlow_template_S6.docx
+++ b/docs/s6/UrbanFlow_template_S6.docx
@@ -988,17 +988,17 @@
           </w:tcPr>
           <w:p>
             <w:r>
-              <w:t>FICHE TRAJET : 7, Ouakam &gt; Palais 2, jour et heure non précisés.</w:t>
+              <w:t>FICHE TRAJET : ligne 7, Ouakam &gt; Palais 2, non disponible.</w:t>
               <w:br/>
               <w:t>TEMPS DE TRAJET : non fourni ici, voir le calcul de trajet de l'application (TomTom).</w:t>
               <w:br/>
               <w:t>ANALYSE : non disponible.</w:t>
               <w:br/>
-              <w:t>ALERTES : pas de relevé terrain en bus, heures de pointe non précisées, heure demandée non fournie.</w:t>
+              <w:t>ALERTES : pas de relevé en bus, heures de pointe non spécifiées, heure demandée non précisée.</w:t>
               <w:br/>
-              <w:t>RECOMMANDATIONS : vérifier le temps de trajet sur l'application TomTom avant de partir.</w:t>
+              <w:t>RECOMMANDATIONS : consultez l'application TomTom pour obtenir une estimation du temps de trajet avant votre départ.</w:t>
               <w:br/>
-              <w:t>Source : catalogue DDD.</w:t>
+              <w:t>Source : BASE (pôles et gares de départ, pôles d'arrivée au centre).</w:t>
             </w:r>
           </w:p>
         </w:tc>
@@ -1211,6 +1211,88 @@
       </w:tr>
     </w:tbl>
     <w:p/>
+    <w:p>
+      <w:r>
+        <w:drawing>
+          <wp:inline xmlns:a="http://schemas.openxmlformats.org/drawingml/2006/main" xmlns:pic="http://schemas.openxmlformats.org/drawingml/2006/picture">
+            <wp:extent cx="5486400" cy="2533070"/>
+            <wp:docPr id="1" name="Picture 1"/>
+            <wp:cNvGraphicFramePr>
+              <a:graphicFrameLocks noChangeAspect="1"/>
+            </wp:cNvGraphicFramePr>
+            <a:graphic>
+              <a:graphicData uri="http://schemas.openxmlformats.org/drawingml/2006/picture">
+                <pic:pic>
+                  <pic:nvPicPr>
+                    <pic:cNvPr id="0" name="testA.png"/>
+                    <pic:cNvPicPr/>
+                  </pic:nvPicPr>
+                  <pic:blipFill>
+                    <a:blip r:embed="rId9"/>
+                    <a:stretch>
+                      <a:fillRect/>
+                    </a:stretch>
+                  </pic:blipFill>
+                  <pic:spPr>
+                    <a:xfrm>
+                      <a:off x="0" y="0"/>
+                      <a:ext cx="5486400" cy="2533070"/>
+                    </a:xfrm>
+                    <a:prstGeom prst="rect"/>
+                  </pic:spPr>
+                </pic:pic>
+              </a:graphicData>
+            </a:graphic>
+          </wp:inline>
+        </w:drawing>
+      </w:r>
+    </w:p>
+    <w:p>
+      <w:r>
+        <w:t>Capture Test A (Dify, Test Run 10:17:03).</w:t>
+      </w:r>
+    </w:p>
+    <w:p>
+      <w:r>
+        <w:drawing>
+          <wp:inline xmlns:a="http://schemas.openxmlformats.org/drawingml/2006/main" xmlns:pic="http://schemas.openxmlformats.org/drawingml/2006/picture">
+            <wp:extent cx="5486400" cy="2545088"/>
+            <wp:docPr id="2" name="Picture 2"/>
+            <wp:cNvGraphicFramePr>
+              <a:graphicFrameLocks noChangeAspect="1"/>
+            </wp:cNvGraphicFramePr>
+            <a:graphic>
+              <a:graphicData uri="http://schemas.openxmlformats.org/drawingml/2006/picture">
+                <pic:pic>
+                  <pic:nvPicPr>
+                    <pic:cNvPr id="0" name="testB.png"/>
+                    <pic:cNvPicPr/>
+                  </pic:nvPicPr>
+                  <pic:blipFill>
+                    <a:blip r:embed="rId10"/>
+                    <a:stretch>
+                      <a:fillRect/>
+                    </a:stretch>
+                  </pic:blipFill>
+                  <pic:spPr>
+                    <a:xfrm>
+                      <a:off x="0" y="0"/>
+                      <a:ext cx="5486400" cy="2545088"/>
+                    </a:xfrm>
+                    <a:prstGeom prst="rect"/>
+                  </pic:spPr>
+                </pic:pic>
+              </a:graphicData>
+            </a:graphic>
+          </wp:inline>
+        </w:drawing>
+      </w:r>
+    </w:p>
+    <w:p>
+      <w:r>
+        <w:t>Capture Test B (Dify, Test Run 10:15:50).</w:t>
+      </w:r>
+    </w:p>
     <w:p>
       <w:r>
         <w:t>Remarque : le relevé du Test B est un exemple de test, pas une mesure réelle. Limite observée : la réponse indique que l'heure du relevé n'est pas précisée, alors que le relevé contenait une date et une heure. À corriger dans le prompt si besoin (recopier l'horodatage fourni).</w:t>
@@ -1634,7 +1716,7 @@
     </w:p>
     <w:p>
       <w:r>
-        <w:t>☐  Captures d'écran jointes à chaque étape clé</w:t>
+        <w:t>☐  Captures d'écran des tests A et B jointes (autres étapes : à ajouter)</w:t>
       </w:r>
     </w:p>
     <w:sectPr>

</xml_diff>